<commit_message>
Unify GuardNote with Naver green
</commit_message>
<xml_diff>
--- a/docs/GuardNote_사용설명서.docx
+++ b/docs/GuardNote_사용설명서.docx
@@ -16,7 +16,7 @@
           <w:rFonts w:ascii="Arial Unicode MS" w:hAnsi="Arial Unicode MS" w:eastAsia="Arial Unicode MS" w:cs="Arial Unicode MS" w:hint="eastAsia"/>
           <w:b/>
           <w:i w:val="0"/>
-          <w:color w:val="EB6917"/>
+          <w:color w:val="03C75A"/>
           <w:sz w:val="16"/>
         </w:rPr>
         <w:t>GUARDNOTE PRODUCT MANUAL · 2026.07</w:t>
@@ -126,7 +126,7 @@
               <w:bottom w:w="55" w:type="dxa"/>
               <w:end w:w="120" w:type="dxa"/>
             </w:tcMar>
-            <w:shd w:fill="F7F5F1"/>
+            <w:shd w:fill="F7F8F7"/>
           </w:tcPr>
           <w:p>
             <w:pPr>
@@ -175,7 +175,7 @@
           <w:rFonts w:ascii="Arial Unicode MS" w:hAnsi="Arial Unicode MS" w:eastAsia="Arial Unicode MS" w:cs="Arial Unicode MS" w:hint="eastAsia"/>
           <w:b/>
           <w:i w:val="0"/>
-          <w:color w:val="EB6917"/>
+          <w:color w:val="03C75A"/>
           <w:sz w:val="16"/>
         </w:rPr>
         <w:t>01 / USER GUIDE</w:t>
@@ -323,7 +323,7 @@
               <w:bottom w:w="55" w:type="dxa"/>
               <w:end w:w="120" w:type="dxa"/>
             </w:tcMar>
-            <w:shd w:fill="E8F5EF"/>
+            <w:shd w:fill="E9FBF1"/>
           </w:tcPr>
           <w:p>
             <w:pPr>
@@ -334,7 +334,7 @@
                 <w:rFonts w:ascii="Arial Unicode MS" w:hAnsi="Arial Unicode MS" w:eastAsia="Arial Unicode MS" w:cs="Arial Unicode MS" w:hint="eastAsia"/>
                 <w:b/>
                 <w:i w:val="0"/>
-                <w:color w:val="23845A"/>
+                <w:color w:val="03C75A"/>
                 <w:sz w:val="20"/>
               </w:rPr>
               <w:t>권장 순서</w:t>
@@ -390,7 +390,7 @@
               <w:bottom w:w="55" w:type="dxa"/>
               <w:end w:w="120" w:type="dxa"/>
             </w:tcMar>
-            <w:shd w:fill="FFF1E7"/>
+            <w:shd w:fill="E9FBF1"/>
           </w:tcPr>
           <w:p>
             <w:pPr>
@@ -401,7 +401,7 @@
                 <w:rFonts w:ascii="Arial Unicode MS" w:hAnsi="Arial Unicode MS" w:eastAsia="Arial Unicode MS" w:cs="Arial Unicode MS" w:hint="eastAsia"/>
                 <w:b/>
                 <w:i w:val="0"/>
-                <w:color w:val="C94F06"/>
+                <w:color w:val="00A64B"/>
                 <w:sz w:val="16"/>
               </w:rPr>
               <w:t>메뉴</w:t>
@@ -418,7 +418,7 @@
               <w:bottom w:w="55" w:type="dxa"/>
               <w:end w:w="120" w:type="dxa"/>
             </w:tcMar>
-            <w:shd w:fill="FFF1E7"/>
+            <w:shd w:fill="E9FBF1"/>
           </w:tcPr>
           <w:p>
             <w:pPr>
@@ -429,7 +429,7 @@
                 <w:rFonts w:ascii="Arial Unicode MS" w:hAnsi="Arial Unicode MS" w:eastAsia="Arial Unicode MS" w:cs="Arial Unicode MS" w:hint="eastAsia"/>
                 <w:b/>
                 <w:i w:val="0"/>
-                <w:color w:val="C94F06"/>
+                <w:color w:val="00A64B"/>
                 <w:sz w:val="16"/>
               </w:rPr>
               <w:t>무엇을 하는 곳인가</w:t>
@@ -446,7 +446,7 @@
               <w:bottom w:w="55" w:type="dxa"/>
               <w:end w:w="120" w:type="dxa"/>
             </w:tcMar>
-            <w:shd w:fill="FFF1E7"/>
+            <w:shd w:fill="E9FBF1"/>
           </w:tcPr>
           <w:p>
             <w:pPr>
@@ -457,7 +457,7 @@
                 <w:rFonts w:ascii="Arial Unicode MS" w:hAnsi="Arial Unicode MS" w:eastAsia="Arial Unicode MS" w:cs="Arial Unicode MS" w:hint="eastAsia"/>
                 <w:b/>
                 <w:i w:val="0"/>
-                <w:color w:val="C94F06"/>
+                <w:color w:val="00A64B"/>
                 <w:sz w:val="16"/>
               </w:rPr>
               <w:t>핵심 결과</w:t>
@@ -978,7 +978,7 @@
           <w:rFonts w:ascii="Arial Unicode MS" w:hAnsi="Arial Unicode MS" w:eastAsia="Arial Unicode MS" w:cs="Arial Unicode MS" w:hint="eastAsia"/>
           <w:b/>
           <w:i w:val="0"/>
-          <w:color w:val="EB6917"/>
+          <w:color w:val="03C75A"/>
           <w:sz w:val="16"/>
         </w:rPr>
         <w:t>02 / USER GUIDE</w:t>
@@ -1204,7 +1204,7 @@
               <w:bottom w:w="55" w:type="dxa"/>
               <w:end w:w="120" w:type="dxa"/>
             </w:tcMar>
-            <w:shd w:fill="FFF1E7"/>
+            <w:shd w:fill="E9FBF1"/>
           </w:tcPr>
           <w:p>
             <w:pPr>
@@ -1215,7 +1215,7 @@
                 <w:rFonts w:ascii="Arial Unicode MS" w:hAnsi="Arial Unicode MS" w:eastAsia="Arial Unicode MS" w:cs="Arial Unicode MS" w:hint="eastAsia"/>
                 <w:b/>
                 <w:i w:val="0"/>
-                <w:color w:val="C94F06"/>
+                <w:color w:val="00A64B"/>
                 <w:sz w:val="20"/>
               </w:rPr>
               <w:t>실무 팁</w:t>
@@ -1253,7 +1253,7 @@
           <w:rFonts w:ascii="Arial Unicode MS" w:hAnsi="Arial Unicode MS" w:eastAsia="Arial Unicode MS" w:cs="Arial Unicode MS" w:hint="eastAsia"/>
           <w:b/>
           <w:i w:val="0"/>
-          <w:color w:val="EB6917"/>
+          <w:color w:val="03C75A"/>
           <w:sz w:val="16"/>
         </w:rPr>
         <w:t>03 / USER GUIDE</w:t>
@@ -1419,7 +1419,7 @@
               <w:bottom w:w="55" w:type="dxa"/>
               <w:end w:w="120" w:type="dxa"/>
             </w:tcMar>
-            <w:shd w:fill="FFF1E7"/>
+            <w:shd w:fill="E9FBF1"/>
           </w:tcPr>
           <w:p>
             <w:pPr>
@@ -1430,7 +1430,7 @@
                 <w:rFonts w:ascii="Arial Unicode MS" w:hAnsi="Arial Unicode MS" w:eastAsia="Arial Unicode MS" w:cs="Arial Unicode MS" w:hint="eastAsia"/>
                 <w:b/>
                 <w:i w:val="0"/>
-                <w:color w:val="C94F06"/>
+                <w:color w:val="00A64B"/>
                 <w:sz w:val="16"/>
               </w:rPr>
               <w:t>메뉴</w:t>
@@ -1447,7 +1447,7 @@
               <w:bottom w:w="55" w:type="dxa"/>
               <w:end w:w="120" w:type="dxa"/>
             </w:tcMar>
-            <w:shd w:fill="FFF1E7"/>
+            <w:shd w:fill="E9FBF1"/>
           </w:tcPr>
           <w:p>
             <w:pPr>
@@ -1458,7 +1458,7 @@
                 <w:rFonts w:ascii="Arial Unicode MS" w:hAnsi="Arial Unicode MS" w:eastAsia="Arial Unicode MS" w:cs="Arial Unicode MS" w:hint="eastAsia"/>
                 <w:b/>
                 <w:i w:val="0"/>
-                <w:color w:val="C94F06"/>
+                <w:color w:val="00A64B"/>
                 <w:sz w:val="16"/>
               </w:rPr>
               <w:t>무엇을 하는 곳인가</w:t>
@@ -1475,7 +1475,7 @@
               <w:bottom w:w="55" w:type="dxa"/>
               <w:end w:w="120" w:type="dxa"/>
             </w:tcMar>
-            <w:shd w:fill="FFF1E7"/>
+            <w:shd w:fill="E9FBF1"/>
           </w:tcPr>
           <w:p>
             <w:pPr>
@@ -1486,7 +1486,7 @@
                 <w:rFonts w:ascii="Arial Unicode MS" w:hAnsi="Arial Unicode MS" w:eastAsia="Arial Unicode MS" w:cs="Arial Unicode MS" w:hint="eastAsia"/>
                 <w:b/>
                 <w:i w:val="0"/>
-                <w:color w:val="C94F06"/>
+                <w:color w:val="00A64B"/>
                 <w:sz w:val="16"/>
               </w:rPr>
               <w:t>핵심 결과</w:t>
@@ -1766,7 +1766,7 @@
               <w:bottom w:w="55" w:type="dxa"/>
               <w:end w:w="120" w:type="dxa"/>
             </w:tcMar>
-            <w:shd w:fill="FAEAEA"/>
+            <w:shd w:fill="EDF8F2"/>
           </w:tcPr>
           <w:p>
             <w:pPr>
@@ -1777,7 +1777,7 @@
                 <w:rFonts w:ascii="Arial Unicode MS" w:hAnsi="Arial Unicode MS" w:eastAsia="Arial Unicode MS" w:cs="Arial Unicode MS" w:hint="eastAsia"/>
                 <w:b/>
                 <w:i w:val="0"/>
-                <w:color w:val="BC3E3E"/>
+                <w:color w:val="00A64B"/>
                 <w:sz w:val="20"/>
               </w:rPr>
               <w:t>주의</w:t>
@@ -1815,7 +1815,7 @@
           <w:rFonts w:ascii="Arial Unicode MS" w:hAnsi="Arial Unicode MS" w:eastAsia="Arial Unicode MS" w:cs="Arial Unicode MS" w:hint="eastAsia"/>
           <w:b/>
           <w:i w:val="0"/>
-          <w:color w:val="EB6917"/>
+          <w:color w:val="03C75A"/>
           <w:sz w:val="16"/>
         </w:rPr>
         <w:t>04 / USER GUIDE</w:t>
@@ -2083,7 +2083,7 @@
               <w:bottom w:w="55" w:type="dxa"/>
               <w:end w:w="120" w:type="dxa"/>
             </w:tcMar>
-            <w:shd w:fill="E8F5EF"/>
+            <w:shd w:fill="E9FBF1"/>
           </w:tcPr>
           <w:p>
             <w:pPr>
@@ -2094,7 +2094,7 @@
                 <w:rFonts w:ascii="Arial Unicode MS" w:hAnsi="Arial Unicode MS" w:eastAsia="Arial Unicode MS" w:cs="Arial Unicode MS" w:hint="eastAsia"/>
                 <w:b/>
                 <w:i w:val="0"/>
-                <w:color w:val="23845A"/>
+                <w:color w:val="03C75A"/>
                 <w:sz w:val="20"/>
               </w:rPr>
               <w:t>개인정보 보호</w:t>
@@ -2132,7 +2132,7 @@
           <w:rFonts w:ascii="Arial Unicode MS" w:hAnsi="Arial Unicode MS" w:eastAsia="Arial Unicode MS" w:cs="Arial Unicode MS" w:hint="eastAsia"/>
           <w:b/>
           <w:i w:val="0"/>
-          <w:color w:val="EB6917"/>
+          <w:color w:val="03C75A"/>
           <w:sz w:val="16"/>
         </w:rPr>
         <w:t>05 / USER GUIDE</w:t>
@@ -2280,7 +2280,7 @@
               <w:bottom w:w="55" w:type="dxa"/>
               <w:end w:w="120" w:type="dxa"/>
             </w:tcMar>
-            <w:shd w:fill="FFF1E7"/>
+            <w:shd w:fill="E9FBF1"/>
           </w:tcPr>
           <w:p>
             <w:pPr>
@@ -2291,7 +2291,7 @@
                 <w:rFonts w:ascii="Arial Unicode MS" w:hAnsi="Arial Unicode MS" w:eastAsia="Arial Unicode MS" w:cs="Arial Unicode MS" w:hint="eastAsia"/>
                 <w:b/>
                 <w:i w:val="0"/>
-                <w:color w:val="C94F06"/>
+                <w:color w:val="00A64B"/>
                 <w:sz w:val="16"/>
               </w:rPr>
               <w:t>메뉴</w:t>
@@ -2308,7 +2308,7 @@
               <w:bottom w:w="55" w:type="dxa"/>
               <w:end w:w="120" w:type="dxa"/>
             </w:tcMar>
-            <w:shd w:fill="FFF1E7"/>
+            <w:shd w:fill="E9FBF1"/>
           </w:tcPr>
           <w:p>
             <w:pPr>
@@ -2319,7 +2319,7 @@
                 <w:rFonts w:ascii="Arial Unicode MS" w:hAnsi="Arial Unicode MS" w:eastAsia="Arial Unicode MS" w:cs="Arial Unicode MS" w:hint="eastAsia"/>
                 <w:b/>
                 <w:i w:val="0"/>
-                <w:color w:val="C94F06"/>
+                <w:color w:val="00A64B"/>
                 <w:sz w:val="16"/>
               </w:rPr>
               <w:t>무엇을 하는 곳인가</w:t>
@@ -2336,7 +2336,7 @@
               <w:bottom w:w="55" w:type="dxa"/>
               <w:end w:w="120" w:type="dxa"/>
             </w:tcMar>
-            <w:shd w:fill="FFF1E7"/>
+            <w:shd w:fill="E9FBF1"/>
           </w:tcPr>
           <w:p>
             <w:pPr>
@@ -2347,7 +2347,7 @@
                 <w:rFonts w:ascii="Arial Unicode MS" w:hAnsi="Arial Unicode MS" w:eastAsia="Arial Unicode MS" w:cs="Arial Unicode MS" w:hint="eastAsia"/>
                 <w:b/>
                 <w:i w:val="0"/>
-                <w:color w:val="C94F06"/>
+                <w:color w:val="00A64B"/>
                 <w:sz w:val="16"/>
               </w:rPr>
               <w:t>핵심 결과</w:t>
@@ -2702,7 +2702,7 @@
           <w:rFonts w:ascii="Arial Unicode MS" w:hAnsi="Arial Unicode MS" w:eastAsia="Arial Unicode MS" w:cs="Arial Unicode MS" w:hint="eastAsia"/>
           <w:b/>
           <w:i w:val="0"/>
-          <w:color w:val="EB6917"/>
+          <w:color w:val="03C75A"/>
           <w:sz w:val="16"/>
         </w:rPr>
         <w:t>06 / USER GUIDE</w:t>
@@ -2868,7 +2868,7 @@
               <w:bottom w:w="55" w:type="dxa"/>
               <w:end w:w="120" w:type="dxa"/>
             </w:tcMar>
-            <w:shd w:fill="FAEAEA"/>
+            <w:shd w:fill="EDF8F2"/>
           </w:tcPr>
           <w:p>
             <w:pPr>
@@ -2879,7 +2879,7 @@
                 <w:rFonts w:ascii="Arial Unicode MS" w:hAnsi="Arial Unicode MS" w:eastAsia="Arial Unicode MS" w:cs="Arial Unicode MS" w:hint="eastAsia"/>
                 <w:b/>
                 <w:i w:val="0"/>
-                <w:color w:val="BC3E3E"/>
+                <w:color w:val="00A64B"/>
                 <w:sz w:val="20"/>
               </w:rPr>
               <w:t>불일치 예시</w:t>
@@ -2925,7 +2925,7 @@
               <w:bottom w:w="55" w:type="dxa"/>
               <w:end w:w="120" w:type="dxa"/>
             </w:tcMar>
-            <w:shd w:fill="FFF1E7"/>
+            <w:shd w:fill="E9FBF1"/>
           </w:tcPr>
           <w:p>
             <w:pPr>
@@ -2936,7 +2936,7 @@
                 <w:rFonts w:ascii="Arial Unicode MS" w:hAnsi="Arial Unicode MS" w:eastAsia="Arial Unicode MS" w:cs="Arial Unicode MS" w:hint="eastAsia"/>
                 <w:b/>
                 <w:i w:val="0"/>
-                <w:color w:val="C94F06"/>
+                <w:color w:val="00A64B"/>
                 <w:sz w:val="20"/>
               </w:rPr>
               <w:t>권장 보완자료</w:t>
@@ -2974,7 +2974,7 @@
           <w:rFonts w:ascii="Arial Unicode MS" w:hAnsi="Arial Unicode MS" w:eastAsia="Arial Unicode MS" w:cs="Arial Unicode MS" w:hint="eastAsia"/>
           <w:b/>
           <w:i w:val="0"/>
-          <w:color w:val="EB6917"/>
+          <w:color w:val="03C75A"/>
           <w:sz w:val="16"/>
         </w:rPr>
         <w:t>07 / USER GUIDE</w:t>
@@ -3238,7 +3238,7 @@
           <w:rFonts w:ascii="Arial Unicode MS" w:hAnsi="Arial Unicode MS" w:eastAsia="Arial Unicode MS" w:cs="Arial Unicode MS" w:hint="eastAsia"/>
           <w:b/>
           <w:i w:val="0"/>
-          <w:color w:val="EB6917"/>
+          <w:color w:val="03C75A"/>
           <w:sz w:val="16"/>
         </w:rPr>
         <w:t>08 / USER GUIDE</w:t>
@@ -3414,7 +3414,7 @@
               <w:bottom w:w="55" w:type="dxa"/>
               <w:end w:w="120" w:type="dxa"/>
             </w:tcMar>
-            <w:shd w:fill="FFF1E7"/>
+            <w:shd w:fill="E9FBF1"/>
           </w:tcPr>
           <w:p>
             <w:pPr>
@@ -3425,7 +3425,7 @@
                 <w:rFonts w:ascii="Arial Unicode MS" w:hAnsi="Arial Unicode MS" w:eastAsia="Arial Unicode MS" w:cs="Arial Unicode MS" w:hint="eastAsia"/>
                 <w:b/>
                 <w:i w:val="0"/>
-                <w:color w:val="C94F06"/>
+                <w:color w:val="00A64B"/>
                 <w:sz w:val="16"/>
               </w:rPr>
               <w:t>메뉴</w:t>
@@ -3442,7 +3442,7 @@
               <w:bottom w:w="55" w:type="dxa"/>
               <w:end w:w="120" w:type="dxa"/>
             </w:tcMar>
-            <w:shd w:fill="FFF1E7"/>
+            <w:shd w:fill="E9FBF1"/>
           </w:tcPr>
           <w:p>
             <w:pPr>
@@ -3453,7 +3453,7 @@
                 <w:rFonts w:ascii="Arial Unicode MS" w:hAnsi="Arial Unicode MS" w:eastAsia="Arial Unicode MS" w:cs="Arial Unicode MS" w:hint="eastAsia"/>
                 <w:b/>
                 <w:i w:val="0"/>
-                <w:color w:val="C94F06"/>
+                <w:color w:val="00A64B"/>
                 <w:sz w:val="16"/>
               </w:rPr>
               <w:t>무엇을 하는 곳인가</w:t>
@@ -3470,7 +3470,7 @@
               <w:bottom w:w="55" w:type="dxa"/>
               <w:end w:w="120" w:type="dxa"/>
             </w:tcMar>
-            <w:shd w:fill="FFF1E7"/>
+            <w:shd w:fill="E9FBF1"/>
           </w:tcPr>
           <w:p>
             <w:pPr>
@@ -3481,7 +3481,7 @@
                 <w:rFonts w:ascii="Arial Unicode MS" w:hAnsi="Arial Unicode MS" w:eastAsia="Arial Unicode MS" w:cs="Arial Unicode MS" w:hint="eastAsia"/>
                 <w:b/>
                 <w:i w:val="0"/>
-                <w:color w:val="C94F06"/>
+                <w:color w:val="00A64B"/>
                 <w:sz w:val="16"/>
               </w:rPr>
               <w:t>핵심 결과</w:t>
@@ -3761,7 +3761,7 @@
               <w:bottom w:w="55" w:type="dxa"/>
               <w:end w:w="120" w:type="dxa"/>
             </w:tcMar>
-            <w:shd w:fill="FFF1E7"/>
+            <w:shd w:fill="E9FBF1"/>
           </w:tcPr>
           <w:p>
             <w:pPr>
@@ -3772,7 +3772,7 @@
                 <w:rFonts w:ascii="Arial Unicode MS" w:hAnsi="Arial Unicode MS" w:eastAsia="Arial Unicode MS" w:cs="Arial Unicode MS" w:hint="eastAsia"/>
                 <w:b/>
                 <w:i w:val="0"/>
-                <w:color w:val="C94F06"/>
+                <w:color w:val="00A64B"/>
                 <w:sz w:val="20"/>
               </w:rPr>
               <w:t>대표 검토 항목</w:t>
@@ -3810,7 +3810,7 @@
           <w:rFonts w:ascii="Arial Unicode MS" w:hAnsi="Arial Unicode MS" w:eastAsia="Arial Unicode MS" w:cs="Arial Unicode MS" w:hint="eastAsia"/>
           <w:b/>
           <w:i w:val="0"/>
-          <w:color w:val="EB6917"/>
+          <w:color w:val="03C75A"/>
           <w:sz w:val="16"/>
         </w:rPr>
         <w:t>09 / USER GUIDE</w:t>
@@ -3994,7 +3994,7 @@
               <w:bottom w:w="55" w:type="dxa"/>
               <w:end w:w="120" w:type="dxa"/>
             </w:tcMar>
-            <w:shd w:fill="E8F5EF"/>
+            <w:shd w:fill="E9FBF1"/>
           </w:tcPr>
           <w:p>
             <w:pPr>
@@ -4005,7 +4005,7 @@
                 <w:rFonts w:ascii="Arial Unicode MS" w:hAnsi="Arial Unicode MS" w:eastAsia="Arial Unicode MS" w:cs="Arial Unicode MS" w:hint="eastAsia"/>
                 <w:b/>
                 <w:i w:val="0"/>
-                <w:color w:val="23845A"/>
+                <w:color w:val="03C75A"/>
                 <w:sz w:val="20"/>
               </w:rPr>
               <w:t>출시 예정 기능을 완성한 부분</w:t>
@@ -4051,7 +4051,7 @@
               <w:bottom w:w="55" w:type="dxa"/>
               <w:end w:w="120" w:type="dxa"/>
             </w:tcMar>
-            <w:shd w:fill="FAEAEA"/>
+            <w:shd w:fill="EDF8F2"/>
           </w:tcPr>
           <w:p>
             <w:pPr>
@@ -4062,7 +4062,7 @@
                 <w:rFonts w:ascii="Arial Unicode MS" w:hAnsi="Arial Unicode MS" w:eastAsia="Arial Unicode MS" w:cs="Arial Unicode MS" w:hint="eastAsia"/>
                 <w:b/>
                 <w:i w:val="0"/>
-                <w:color w:val="BC3E3E"/>
+                <w:color w:val="00A64B"/>
                 <w:sz w:val="20"/>
               </w:rPr>
               <w:t>최종 승인 원칙</w:t>
@@ -4100,7 +4100,7 @@
           <w:rFonts w:ascii="Arial Unicode MS" w:hAnsi="Arial Unicode MS" w:eastAsia="Arial Unicode MS" w:cs="Arial Unicode MS" w:hint="eastAsia"/>
           <w:b/>
           <w:i w:val="0"/>
-          <w:color w:val="EB6917"/>
+          <w:color w:val="03C75A"/>
           <w:sz w:val="16"/>
         </w:rPr>
         <w:t>10 / USER GUIDE</w:t>
@@ -4248,7 +4248,7 @@
               <w:bottom w:w="55" w:type="dxa"/>
               <w:end w:w="120" w:type="dxa"/>
             </w:tcMar>
-            <w:shd w:fill="FFF1E7"/>
+            <w:shd w:fill="E9FBF1"/>
           </w:tcPr>
           <w:p>
             <w:pPr>
@@ -4259,7 +4259,7 @@
                 <w:rFonts w:ascii="Arial Unicode MS" w:hAnsi="Arial Unicode MS" w:eastAsia="Arial Unicode MS" w:cs="Arial Unicode MS" w:hint="eastAsia"/>
                 <w:b/>
                 <w:i w:val="0"/>
-                <w:color w:val="C94F06"/>
+                <w:color w:val="00A64B"/>
                 <w:sz w:val="16"/>
               </w:rPr>
               <w:t>메뉴</w:t>
@@ -4276,7 +4276,7 @@
               <w:bottom w:w="55" w:type="dxa"/>
               <w:end w:w="120" w:type="dxa"/>
             </w:tcMar>
-            <w:shd w:fill="FFF1E7"/>
+            <w:shd w:fill="E9FBF1"/>
           </w:tcPr>
           <w:p>
             <w:pPr>
@@ -4287,7 +4287,7 @@
                 <w:rFonts w:ascii="Arial Unicode MS" w:hAnsi="Arial Unicode MS" w:eastAsia="Arial Unicode MS" w:cs="Arial Unicode MS" w:hint="eastAsia"/>
                 <w:b/>
                 <w:i w:val="0"/>
-                <w:color w:val="C94F06"/>
+                <w:color w:val="00A64B"/>
                 <w:sz w:val="16"/>
               </w:rPr>
               <w:t>무엇을 하는 곳인가</w:t>
@@ -4304,7 +4304,7 @@
               <w:bottom w:w="55" w:type="dxa"/>
               <w:end w:w="120" w:type="dxa"/>
             </w:tcMar>
-            <w:shd w:fill="FFF1E7"/>
+            <w:shd w:fill="E9FBF1"/>
           </w:tcPr>
           <w:p>
             <w:pPr>
@@ -4315,7 +4315,7 @@
                 <w:rFonts w:ascii="Arial Unicode MS" w:hAnsi="Arial Unicode MS" w:eastAsia="Arial Unicode MS" w:cs="Arial Unicode MS" w:hint="eastAsia"/>
                 <w:b/>
                 <w:i w:val="0"/>
-                <w:color w:val="C94F06"/>
+                <w:color w:val="00A64B"/>
                 <w:sz w:val="16"/>
               </w:rPr>
               <w:t>핵심 결과</w:t>
@@ -4753,7 +4753,7 @@
           <w:rFonts w:ascii="Arial Unicode MS" w:hAnsi="Arial Unicode MS" w:eastAsia="Arial Unicode MS" w:cs="Arial Unicode MS" w:hint="eastAsia"/>
           <w:b/>
           <w:i w:val="0"/>
-          <w:color w:val="EB6917"/>
+          <w:color w:val="03C75A"/>
           <w:sz w:val="16"/>
         </w:rPr>
         <w:t>11 / USER GUIDE</w:t>
@@ -4919,7 +4919,7 @@
               <w:bottom w:w="55" w:type="dxa"/>
               <w:end w:w="120" w:type="dxa"/>
             </w:tcMar>
-            <w:shd w:fill="FFF1E7"/>
+            <w:shd w:fill="E9FBF1"/>
           </w:tcPr>
           <w:p>
             <w:pPr>
@@ -4930,7 +4930,7 @@
                 <w:rFonts w:ascii="Arial Unicode MS" w:hAnsi="Arial Unicode MS" w:eastAsia="Arial Unicode MS" w:cs="Arial Unicode MS" w:hint="eastAsia"/>
                 <w:b/>
                 <w:i w:val="0"/>
-                <w:color w:val="C94F06"/>
+                <w:color w:val="00A64B"/>
                 <w:sz w:val="16"/>
               </w:rPr>
               <w:t>메뉴</w:t>
@@ -4947,7 +4947,7 @@
               <w:bottom w:w="55" w:type="dxa"/>
               <w:end w:w="120" w:type="dxa"/>
             </w:tcMar>
-            <w:shd w:fill="FFF1E7"/>
+            <w:shd w:fill="E9FBF1"/>
           </w:tcPr>
           <w:p>
             <w:pPr>
@@ -4958,7 +4958,7 @@
                 <w:rFonts w:ascii="Arial Unicode MS" w:hAnsi="Arial Unicode MS" w:eastAsia="Arial Unicode MS" w:cs="Arial Unicode MS" w:hint="eastAsia"/>
                 <w:b/>
                 <w:i w:val="0"/>
-                <w:color w:val="C94F06"/>
+                <w:color w:val="00A64B"/>
                 <w:sz w:val="16"/>
               </w:rPr>
               <w:t>무엇을 하는 곳인가</w:t>
@@ -4975,7 +4975,7 @@
               <w:bottom w:w="55" w:type="dxa"/>
               <w:end w:w="120" w:type="dxa"/>
             </w:tcMar>
-            <w:shd w:fill="FFF1E7"/>
+            <w:shd w:fill="E9FBF1"/>
           </w:tcPr>
           <w:p>
             <w:pPr>
@@ -4986,7 +4986,7 @@
                 <w:rFonts w:ascii="Arial Unicode MS" w:hAnsi="Arial Unicode MS" w:eastAsia="Arial Unicode MS" w:cs="Arial Unicode MS" w:hint="eastAsia"/>
                 <w:b/>
                 <w:i w:val="0"/>
-                <w:color w:val="C94F06"/>
+                <w:color w:val="00A64B"/>
                 <w:sz w:val="16"/>
               </w:rPr>
               <w:t>핵심 결과</w:t>
@@ -5432,7 +5432,7 @@
               <w:bottom w:w="55" w:type="dxa"/>
               <w:end w:w="120" w:type="dxa"/>
             </w:tcMar>
-            <w:shd w:fill="F7F5F1"/>
+            <w:shd w:fill="F7F8F7"/>
           </w:tcPr>
           <w:p>
             <w:pPr>
@@ -5489,7 +5489,7 @@
               <w:bottom w:w="55" w:type="dxa"/>
               <w:end w:w="120" w:type="dxa"/>
             </w:tcMar>
-            <w:shd w:fill="FAEAEA"/>
+            <w:shd w:fill="EDF8F2"/>
           </w:tcPr>
           <w:p>
             <w:pPr>
@@ -5500,7 +5500,7 @@
                 <w:rFonts w:ascii="Arial Unicode MS" w:hAnsi="Arial Unicode MS" w:eastAsia="Arial Unicode MS" w:cs="Arial Unicode MS" w:hint="eastAsia"/>
                 <w:b/>
                 <w:i w:val="0"/>
-                <w:color w:val="BC3E3E"/>
+                <w:color w:val="00A64B"/>
                 <w:sz w:val="20"/>
               </w:rPr>
               <w:t>보안 알림</w:t>
@@ -6058,7 +6058,7 @@
       <w:rFonts w:asciiTheme="majorHAnsi" w:eastAsiaTheme="majorEastAsia" w:hAnsiTheme="majorHAnsi" w:cstheme="majorBidi" w:ascii="Arial Unicode MS" w:hAnsi="Arial Unicode MS" w:eastAsia="Arial Unicode MS" w:cs="Arial Unicode MS" w:hint="eastAsia"/>
       <w:b/>
       <w:bCs/>
-      <w:color w:val="C94F06"/>
+      <w:color w:val="00A64B"/>
       <w:sz w:val="30"/>
       <w:szCs w:val="28"/>
     </w:rPr>
@@ -6082,7 +6082,7 @@
       <w:rFonts w:asciiTheme="majorHAnsi" w:eastAsiaTheme="majorEastAsia" w:hAnsiTheme="majorHAnsi" w:cstheme="majorBidi" w:ascii="Arial Unicode MS" w:hAnsi="Arial Unicode MS" w:eastAsia="Arial Unicode MS" w:cs="Arial Unicode MS" w:hint="eastAsia"/>
       <w:b/>
       <w:bCs/>
-      <w:color w:val="C94F06"/>
+      <w:color w:val="00A64B"/>
       <w:sz w:val="24"/>
       <w:szCs w:val="26"/>
     </w:rPr>

</xml_diff>

<commit_message>
Implement live Claude compliance workflows
</commit_message>
<xml_diff>
--- a/docs/GuardNote_사용설명서.docx
+++ b/docs/GuardNote_사용설명서.docx
@@ -262,7 +262,7 @@
           <w:color w:val="201F1D"/>
           <w:sz w:val="20"/>
         </w:rPr>
-        <w:t>AI가 제안한 답변, 정확도, 문서 근거를 확인한 후 필요한 답변만 점검표에 반영합니다.</w:t>
+        <w:t>AI가 제안한 답변, 근거 명확성, 문서 근거를 확인한 후 필요한 답변만 점검표에 반영합니다.</w:t>
       </w:r>
     </w:p>
     <w:p>
@@ -1884,7 +1884,7 @@
           <w:color w:val="201F1D"/>
           <w:sz w:val="20"/>
         </w:rPr>
-        <w:t>PDF, DOCX, HWP, TXT 문서를 선택하거나 샘플 동의서를 사용합니다.</w:t>
+        <w:t>PDF, DOCX, TXT 문서(최대 6MB)를 선택하거나 샘플 동의서를 사용합니다.</w:t>
       </w:r>
     </w:p>
     <w:p>
@@ -1920,7 +1920,7 @@
           <w:color w:val="201F1D"/>
           <w:sz w:val="20"/>
         </w:rPr>
-        <w:t>문항별 AI 답변, 정확도, 문서 근거를 읽습니다.</w:t>
+        <w:t>문항별 AI 답변, 근거 명확성, 문서 근거를 읽습니다.</w:t>
       </w:r>
     </w:p>
     <w:p>
@@ -1992,7 +1992,7 @@
           <w:color w:val="201F1D"/>
           <w:sz w:val="20"/>
         </w:rPr>
-        <w:t>정확도:</w:t>
+        <w:t>근거 명확성:</w:t>
       </w:r>
       <w:r>
         <w:rPr>
@@ -2002,7 +2002,7 @@
           <w:color w:val="201F1D"/>
           <w:sz w:val="20"/>
         </w:rPr>
-        <w:t xml:space="preserve"> 해당 문서가 질문의 근거로 충분하다고 판단한 신뢰도</w:t>
+        <w:t xml:space="preserve"> 해당 문서가 질문의 근거로 충분하다고 판단한 수준</w:t>
       </w:r>
     </w:p>
     <w:p>
@@ -2112,7 +2112,7 @@
                 <w:color w:val="201F1D"/>
                 <w:sz w:val="18"/>
               </w:rPr>
-              <w:t>현재 데모 분석은 브라우저 안에서 실행되며 선택한 파일을 외부 서비스로 전송하지 않습니다. 운영용 AI를 연결할 때에도 API 키는 서버 환경변수로만 관리해야 합니다.</w:t>
+              <w:t>선택한 문서는 암호화된 연결로 Anthropic Claude API에 전송됩니다. GuardNote 서버와 DB에는 문서 원문을 저장하지 않으며, API 키는 서버 비밀환경변수로만 관리합니다.</w:t>
             </w:r>
           </w:p>
         </w:tc>

</xml_diff>